<commit_message>
Orthographe : créneau et jeux du pack tranchés, cahier de conjugaison 2026 renommé
- Dispositif 2 : « Points à trancher » devient « Décisions » ; créneau = les 3 créneaux d'orthographe
  de la semaine (mardi, jeudi, vendredi) ; Ortho Mémo et Les tournesols restent hors ceintures.
  Paragraphe périmé « Ceinture de transfert » retiré du .docx (H8 et C8 retirées le 20/10/2026).
- « Ceintures de conjugaison 2026 - cahier de progrès A REFAIRE.odt » renommé sans « A REFAIRE »
  (parties CE2 et CM2 refaites le 17/10/2026).
- IDEES-EN-ATTENTE : rubrique Orthographe retirée.

Co-Authored-By: Claude Opus 5.5 <noreply@anthropic.com>
Claude-Session: https://claude.ai/code/session_01W9e46GtXYZT1S7ytgZD28e
</commit_message>
<xml_diff>
--- a/Documents explicatifs des dispositifs/Dispositif2_Orthographe_lexicale_CM1_avec_jeux.docx
+++ b/Documents explicatifs des dispositifs/Dispositif2_Orthographe_lexicale_CM1_avec_jeux.docx
@@ -4347,7 +4347,7 @@
         <w:spacing w:after="160" w:before="360"/>
       </w:pPr>
       <w:r>
-        <w:t xml:space="preserve">Points à trancher</w:t>
+        <w:t xml:space="preserve">Décisions</w:t>
       </w:r>
     </w:p>
     <w:p>
@@ -4375,7 +4375,7 @@
           <w:i w:val="false"/>
           <w:iCs w:val="false"/>
         </w:rPr>
-        <w:t xml:space="preserve"> : l'ancienne version ne prévoyait pas de créneau dédié. Le parcours à ceintures demande 30 min pour l'entraînement collectif et 15 min par fiche : à placer, par exemple, à côté de la dictée hebdomadaire.</w:t>
+        <w:t xml:space="preserve"> : l'entraînement collectif (30 min) et les fiches (15 min chacune) se font dans les 3 créneaux d'orthographe de la semaine : mardi, jeudi et vendredi (organisation de l'année 2026-2027, choix de l'enseignante, 23/10/2026).</w:t>
       </w:r>
     </w:p>
     <w:p>
@@ -4394,7 +4394,7 @@
           <w:i w:val="false"/>
           <w:iCs w:val="false"/>
         </w:rPr>
-        <w:t xml:space="preserve">Ceinture de transfert</w:t>
+        <w:t xml:space="preserve">Compétences du pack sans ceinture</w:t>
       </w:r>
       <w:r>
         <w:rPr>
@@ -4403,35 +4403,7 @@
           <w:i w:val="false"/>
           <w:iCs w:val="false"/>
         </w:rPr>
-        <w:t xml:space="preserve"> : une ceinture O7 (Marron) de transfert en dictée, sur le modèle de H8 et de C8, pourrait clore la série.</w:t>
-      </w:r>
-    </w:p>
-    <w:p>
-      <w:pPr>
-        <w:pStyle w:val="ListParagraph"/>
-        <w:numPr>
-          <w:ilvl w:val="0"/>
-          <w:numId w:val="2"/>
-        </w:numPr>
-        <w:spacing w:after="100"/>
-      </w:pPr>
-      <w:r>
-        <w:rPr>
-          <w:b/>
-          <w:bCs/>
-          <w:i w:val="false"/>
-          <w:iCs w:val="false"/>
-        </w:rPr>
-        <w:t xml:space="preserve">Compétences du pack sans ceinture</w:t>
-      </w:r>
-      <w:r>
-        <w:rPr>
-          <w:b w:val="false"/>
-          <w:bCs w:val="false"/>
-          <w:i w:val="false"/>
-          <w:iCs w:val="false"/>
-        </w:rPr>
-        <w:t xml:space="preserve"> : les noms en [e] / [té] (Ortho Mémo) et les mots en ac / af / ap (Les tournesols) restent hors ceintures.</w:t>
+        <w:t xml:space="preserve"> : les noms en [e] / [té] (Ortho Mémo) et les mots en ac / af / ap (Les tournesols) restent hors ceintures (choix de l'enseignante, 23/10/2026).</w:t>
       </w:r>
     </w:p>
     <w:sectPr>

</xml_diff>